<commit_message>
Add Stundenlisten feature with Excel import/export, and collapsible sidebar categories
Adds worker hours tracking under Mitarbeiter: per-employee/year sheets with
live formula calculation, auto-prompt for new workers from Mitarbeiterliste,
archive/delete, and Excel import/export via exceljs matching the original
payroll spreadsheet's formulas, colors and layout. Sidebar document categories
are now collapsible (collapsed by default) with per-category accent coloring.
</commit_message>
<xml_diff>
--- a/public/sonstige/sonstige.docx
+++ b/public/sonstige/sonstige.docx
@@ -488,33 +488,6 @@
         </w:rPr>
         <w:tab/>
       </w:r>
-    </w:p>
-    <w:p>
-      <w:pPr>
-        <w:rPr>
-          <w:rFonts w:ascii="Malgun Gothic Semilight" w:eastAsia="Malgun Gothic Semilight" w:hAnsi="Malgun Gothic Semilight" w:cs="Malgun Gothic Semilight"/>
-          <w:sz w:val="24"/>
-          <w:szCs w:val="24"/>
-        </w:rPr>
-      </w:pPr>
-    </w:p>
-    <w:p>
-      <w:pPr>
-        <w:rPr>
-          <w:rFonts w:ascii="Malgun Gothic Semilight" w:eastAsia="Malgun Gothic Semilight" w:hAnsi="Malgun Gothic Semilight" w:cs="Malgun Gothic Semilight"/>
-          <w:sz w:val="24"/>
-          <w:szCs w:val="24"/>
-        </w:rPr>
-      </w:pPr>
-    </w:p>
-    <w:p>
-      <w:pPr>
-        <w:rPr>
-          <w:rFonts w:ascii="Malgun Gothic Semilight" w:eastAsia="Malgun Gothic Semilight" w:hAnsi="Malgun Gothic Semilight" w:cs="Malgun Gothic Semilight"/>
-          <w:sz w:val="24"/>
-          <w:szCs w:val="24"/>
-        </w:rPr>
-      </w:pPr>
     </w:p>
     <w:sectPr>
       <w:headerReference w:type="even" r:id="rId6"/>

</xml_diff>